<commit_message>
more updates to readme
</commit_message>
<xml_diff>
--- a/Doc/Didactic_PCB_V1_0_user_guide.docx
+++ b/Doc/Didactic_PCB_V1_0_user_guide.docx
@@ -11,20 +11,54 @@
           <w:specVanish/>
         </w:rPr>
       </w:pPr>
+      <w:proofErr w:type="spellStart"/>
       <w:r>
         <w:rPr>
           <w:sz w:val="56"/>
           <w:szCs w:val="56"/>
         </w:rPr>
-        <w:t xml:space="preserve">Didactic </w:t>
-      </w:r>
+        <w:t>Didactic</w:t>
+      </w:r>
+      <w:proofErr w:type="spellEnd"/>
       <w:r>
         <w:rPr>
           <w:sz w:val="56"/>
           <w:szCs w:val="56"/>
         </w:rPr>
-        <w:t>PCB V1.0 user guide</w:t>
-      </w:r>
+        <w:t xml:space="preserve"> </w:t>
+      </w:r>
+      <w:r>
+        <w:rPr>
+          <w:sz w:val="56"/>
+          <w:szCs w:val="56"/>
+        </w:rPr>
+        <w:t xml:space="preserve">PCB V1.0 </w:t>
+      </w:r>
+      <w:proofErr w:type="spellStart"/>
+      <w:r>
+        <w:rPr>
+          <w:sz w:val="56"/>
+          <w:szCs w:val="56"/>
+        </w:rPr>
+        <w:t>user</w:t>
+      </w:r>
+      <w:proofErr w:type="spellEnd"/>
+      <w:r>
+        <w:rPr>
+          <w:sz w:val="56"/>
+          <w:szCs w:val="56"/>
+        </w:rPr>
+        <w:t xml:space="preserve"> </w:t>
+      </w:r>
+      <w:proofErr w:type="spellStart"/>
+      <w:r>
+        <w:rPr>
+          <w:sz w:val="56"/>
+          <w:szCs w:val="56"/>
+        </w:rPr>
+        <w:t>guide</w:t>
+      </w:r>
+      <w:proofErr w:type="spellEnd"/>
     </w:p>
     <w:p>
       <w:pPr>
@@ -886,9 +920,14 @@
         <w:t>Power</w:t>
       </w:r>
       <w:r>
-        <w:t xml:space="preserve"> and start-up</w:t>
+        <w:t xml:space="preserve"> and </w:t>
+      </w:r>
+      <w:proofErr w:type="spellStart"/>
+      <w:r>
+        <w:t>start-up</w:t>
       </w:r>
       <w:bookmarkEnd w:id="0"/>
+      <w:proofErr w:type="spellEnd"/>
     </w:p>
     <w:p>
       <w:pPr>
@@ -946,13 +985,23 @@
         </w:rPr>
         <w:t xml:space="preserve">rrel jack or from the </w:t>
       </w:r>
-      <w:r>
-        <w:rPr>
-          <w:sz w:val="24"/>
-          <w:szCs w:val="24"/>
-          <w:lang w:val="en-US"/>
-        </w:rPr>
-        <w:t xml:space="preserve">SysCtrl </w:t>
+      <w:proofErr w:type="spellStart"/>
+      <w:r>
+        <w:rPr>
+          <w:sz w:val="24"/>
+          <w:szCs w:val="24"/>
+          <w:lang w:val="en-US"/>
+        </w:rPr>
+        <w:t>SysCtrl</w:t>
+      </w:r>
+      <w:proofErr w:type="spellEnd"/>
+      <w:r>
+        <w:rPr>
+          <w:sz w:val="24"/>
+          <w:szCs w:val="24"/>
+          <w:lang w:val="en-US"/>
+        </w:rPr>
+        <w:t xml:space="preserve"> </w:t>
       </w:r>
       <w:r>
         <w:rPr>
@@ -1024,7 +1073,25 @@
           <w:szCs w:val="24"/>
           <w:lang w:val="en-US"/>
         </w:rPr>
-        <w:t xml:space="preserve">jack and the SysCtrl Mini-USB port are used at the same time, then </w:t>
+        <w:t xml:space="preserve">jack and the </w:t>
+      </w:r>
+      <w:proofErr w:type="spellStart"/>
+      <w:r>
+        <w:rPr>
+          <w:sz w:val="24"/>
+          <w:szCs w:val="24"/>
+          <w:lang w:val="en-US"/>
+        </w:rPr>
+        <w:t>SysCtrl</w:t>
+      </w:r>
+      <w:proofErr w:type="spellEnd"/>
+      <w:r>
+        <w:rPr>
+          <w:sz w:val="24"/>
+          <w:szCs w:val="24"/>
+          <w:lang w:val="en-US"/>
+        </w:rPr>
+        <w:t xml:space="preserve"> Mini-USB port are used at the same time, then </w:t>
       </w:r>
       <w:r>
         <w:rPr>
@@ -1073,7 +1140,25 @@
           <w:szCs w:val="24"/>
           <w:lang w:val="en-US"/>
         </w:rPr>
-        <w:t xml:space="preserve">near the SysCtrl Mini-USB port should be lit to indicate </w:t>
+        <w:t xml:space="preserve">near the </w:t>
+      </w:r>
+      <w:proofErr w:type="spellStart"/>
+      <w:r>
+        <w:rPr>
+          <w:sz w:val="24"/>
+          <w:szCs w:val="24"/>
+          <w:lang w:val="en-US"/>
+        </w:rPr>
+        <w:t>SysCtrl</w:t>
+      </w:r>
+      <w:proofErr w:type="spellEnd"/>
+      <w:r>
+        <w:rPr>
+          <w:sz w:val="24"/>
+          <w:szCs w:val="24"/>
+          <w:lang w:val="en-US"/>
+        </w:rPr>
+        <w:t xml:space="preserve"> Mini-USB port should be lit to indicate </w:t>
       </w:r>
       <w:r>
         <w:rPr>
@@ -1089,7 +1174,25 @@
           <w:szCs w:val="24"/>
           <w:lang w:val="en-US"/>
         </w:rPr>
-        <w:t xml:space="preserve"> LED (D702) should also be lit to indicate that</w:t>
+        <w:t xml:space="preserve"> LED (D702) should also be </w:t>
+      </w:r>
+      <w:proofErr w:type="gramStart"/>
+      <w:r>
+        <w:rPr>
+          <w:sz w:val="24"/>
+          <w:szCs w:val="24"/>
+          <w:lang w:val="en-US"/>
+        </w:rPr>
+        <w:t>lit</w:t>
+      </w:r>
+      <w:proofErr w:type="gramEnd"/>
+      <w:r>
+        <w:rPr>
+          <w:sz w:val="24"/>
+          <w:szCs w:val="24"/>
+          <w:lang w:val="en-US"/>
+        </w:rPr>
+        <w:t xml:space="preserve"> to indicate that</w:t>
       </w:r>
       <w:r>
         <w:rPr>
@@ -1990,11 +2093,19 @@
         </w:rPr>
         <w:t xml:space="preserve">2.1 </w:t>
       </w:r>
-      <w:r>
-        <w:rPr>
-          <w:lang w:val="en-US"/>
-        </w:rPr>
-        <w:t>SysCtrl 3.3</w:t>
+      <w:proofErr w:type="spellStart"/>
+      <w:r>
+        <w:rPr>
+          <w:lang w:val="en-US"/>
+        </w:rPr>
+        <w:t>SysCtrl</w:t>
+      </w:r>
+      <w:proofErr w:type="spellEnd"/>
+      <w:r>
+        <w:rPr>
+          <w:lang w:val="en-US"/>
+        </w:rPr>
+        <w:t xml:space="preserve"> 3.3</w:t>
       </w:r>
       <w:r>
         <w:rPr>
@@ -2024,7 +2135,25 @@
           <w:szCs w:val="24"/>
           <w:lang w:val="en-US"/>
         </w:rPr>
-        <w:t xml:space="preserve">All SysCtrl IOs are level shifted to 3.3V and available </w:t>
+        <w:t xml:space="preserve">All </w:t>
+      </w:r>
+      <w:proofErr w:type="spellStart"/>
+      <w:r>
+        <w:rPr>
+          <w:sz w:val="24"/>
+          <w:szCs w:val="24"/>
+          <w:lang w:val="en-US"/>
+        </w:rPr>
+        <w:t>SysCtrl</w:t>
+      </w:r>
+      <w:proofErr w:type="spellEnd"/>
+      <w:r>
+        <w:rPr>
+          <w:sz w:val="24"/>
+          <w:szCs w:val="24"/>
+          <w:lang w:val="en-US"/>
+        </w:rPr>
+        <w:t xml:space="preserve"> IOs are level shifted to 3.3V and available </w:t>
       </w:r>
       <w:r>
         <w:rPr>
@@ -4125,12 +4254,14 @@
                 <w:lang w:val="en-US"/>
               </w:rPr>
             </w:pPr>
+            <w:proofErr w:type="spellStart"/>
             <w:r>
               <w:rPr>
                 <w:lang w:val="en-US"/>
               </w:rPr>
               <w:t>pwr</w:t>
             </w:r>
+            <w:proofErr w:type="spellEnd"/>
           </w:p>
         </w:tc>
         <w:tc>
@@ -4175,12 +4306,14 @@
                 <w:lang w:val="en-US"/>
               </w:rPr>
             </w:pPr>
+            <w:proofErr w:type="spellStart"/>
             <w:r>
               <w:rPr>
                 <w:lang w:val="en-US"/>
               </w:rPr>
               <w:t>nofault</w:t>
             </w:r>
+            <w:proofErr w:type="spellEnd"/>
           </w:p>
         </w:tc>
         <w:tc>
@@ -4215,7 +4348,19 @@
               <w:rPr>
                 <w:lang w:val="en-US"/>
               </w:rPr>
-              <w:t>. Status LED will blink quickly when power is enabled and fault checking is disabled</w:t>
+              <w:t xml:space="preserve">. Status LED will blink quickly when power is </w:t>
+            </w:r>
+            <w:r>
+              <w:rPr>
+                <w:lang w:val="en-US"/>
+              </w:rPr>
+              <w:t>enabled,</w:t>
+            </w:r>
+            <w:r>
+              <w:rPr>
+                <w:lang w:val="en-US"/>
+              </w:rPr>
+              <w:t xml:space="preserve"> and fault checking is disabled</w:t>
             </w:r>
           </w:p>
         </w:tc>
@@ -4231,12 +4376,14 @@
                 <w:lang w:val="en-US"/>
               </w:rPr>
             </w:pPr>
+            <w:proofErr w:type="spellStart"/>
             <w:r>
               <w:rPr>
                 <w:lang w:val="en-US"/>
               </w:rPr>
               <w:t>enableX</w:t>
             </w:r>
+            <w:proofErr w:type="spellEnd"/>
           </w:p>
         </w:tc>
         <w:tc>
@@ -4301,12 +4448,14 @@
                 <w:lang w:val="en-US"/>
               </w:rPr>
             </w:pPr>
+            <w:proofErr w:type="spellStart"/>
             <w:r>
               <w:rPr>
                 <w:lang w:val="en-US"/>
               </w:rPr>
               <w:t>disableX</w:t>
             </w:r>
+            <w:proofErr w:type="spellEnd"/>
           </w:p>
         </w:tc>
         <w:tc>
@@ -4365,12 +4514,14 @@
                 <w:lang w:val="en-US"/>
               </w:rPr>
             </w:pPr>
+            <w:proofErr w:type="spellStart"/>
             <w:r>
               <w:rPr>
                 <w:lang w:val="en-US"/>
               </w:rPr>
               <w:t>clkX</w:t>
             </w:r>
+            <w:proofErr w:type="spellEnd"/>
           </w:p>
         </w:tc>
         <w:tc>
@@ -4421,12 +4572,14 @@
                 <w:lang w:val="en-US"/>
               </w:rPr>
             </w:pPr>
+            <w:proofErr w:type="spellStart"/>
             <w:r>
               <w:rPr>
                 <w:lang w:val="en-US"/>
               </w:rPr>
               <w:t>cspeed</w:t>
             </w:r>
+            <w:proofErr w:type="spellEnd"/>
           </w:p>
         </w:tc>
         <w:tc>
@@ -4501,12 +4654,14 @@
                 <w:lang w:val="en-US"/>
               </w:rPr>
             </w:pPr>
+            <w:proofErr w:type="spellStart"/>
             <w:r>
               <w:rPr>
                 <w:lang w:val="en-US"/>
               </w:rPr>
               <w:t>rstX</w:t>
             </w:r>
+            <w:proofErr w:type="spellEnd"/>
           </w:p>
         </w:tc>
         <w:tc>
@@ -4557,6 +4712,7 @@
                 <w:lang w:val="en-US"/>
               </w:rPr>
             </w:pPr>
+            <w:proofErr w:type="spellStart"/>
             <w:r>
               <w:rPr>
                 <w:lang w:val="en-US"/>
@@ -4569,6 +4725,7 @@
               </w:rPr>
               <w:t>YX</w:t>
             </w:r>
+            <w:proofErr w:type="spellEnd"/>
           </w:p>
         </w:tc>
         <w:tc>
@@ -4625,12 +4782,14 @@
                 <w:lang w:val="en-US"/>
               </w:rPr>
             </w:pPr>
+            <w:proofErr w:type="spellStart"/>
             <w:r>
               <w:rPr>
                 <w:lang w:val="en-US"/>
               </w:rPr>
               <w:t>setmcYX</w:t>
             </w:r>
+            <w:proofErr w:type="spellEnd"/>
           </w:p>
         </w:tc>
         <w:tc>
@@ -4681,12 +4840,14 @@
                 <w:lang w:val="en-US"/>
               </w:rPr>
             </w:pPr>
+            <w:proofErr w:type="spellStart"/>
             <w:r>
               <w:rPr>
                 <w:lang w:val="en-US"/>
               </w:rPr>
               <w:t>settolYX</w:t>
             </w:r>
+            <w:proofErr w:type="spellEnd"/>
           </w:p>
         </w:tc>
         <w:tc>

</xml_diff>